<commit_message>
Add faculty name (Sreeja B P) to report and presentation
Co-Authored-By: Claude Sonnet 5.5 <noreply@anthropic.com>
</commit_message>
<xml_diff>
--- a/docs/PROJECT_REPORT.docx
+++ b/docs/PROJECT_REPORT.docx
@@ -409,7 +409,7 @@
         <w:rPr>
           <w:color w:val="1A1A1A"/>
         </w:rPr>
-        <w:t>________________________________</w:t>
+        <w:t>Sreeja B P</w:t>
       </w:r>
     </w:p>
     <w:p>
@@ -478,7 +478,7 @@
         <w:pStyle w:val="Heading1"/>
         <w:pageBreakBefore/>
       </w:pPr>
-      <w:bookmarkStart w:id="0" w:name="_Toc242986001"/>
+      <w:bookmarkStart w:id="0" w:name="_Toc242986192"/>
       <w:r>
         <w:lastRenderedPageBreak/>
         <w:t>Abstract</w:t>
@@ -571,7 +571,7 @@
     <w:sdt>
       <w:sdtPr>
         <w:alias w:val="Contents"/>
-        <w:id w:val="-1182360631"/>
+        <w:id w:val="1377355705"/>
       </w:sdtPr>
       <w:sdtEndPr/>
       <w:sdtContent>
@@ -594,7 +594,7 @@
           <w:r>
             <w:fldChar w:fldCharType="separate"/>
           </w:r>
-          <w:hyperlink w:anchor="_Toc242986001" w:history="1">
+          <w:hyperlink w:anchor="_Toc242986192" w:history="1">
             <w:r>
               <w:rPr>
                 <w:rStyle w:val="Hyperlink"/>
@@ -618,7 +618,7 @@
               <w:rPr>
                 <w:noProof/>
               </w:rPr>
-              <w:instrText xml:space="preserve"> PAGEREF _Toc242986001 \h </w:instrText>
+              <w:instrText xml:space="preserve"> PAGEREF _Toc242986192 \h </w:instrText>
             </w:r>
             <w:r>
               <w:rPr>
@@ -655,7 +655,7 @@
               <w:noProof/>
             </w:rPr>
           </w:pPr>
-          <w:hyperlink w:anchor="_Toc242986002" w:history="1">
+          <w:hyperlink w:anchor="_Toc242986193" w:history="1">
             <w:r>
               <w:rPr>
                 <w:rStyle w:val="Hyperlink"/>
@@ -679,7 +679,7 @@
               <w:rPr>
                 <w:noProof/>
               </w:rPr>
-              <w:instrText xml:space="preserve"> PAGEREF _Toc242986002 \h </w:instrText>
+              <w:instrText xml:space="preserve"> PAGEREF _Toc242986193 \h </w:instrText>
             </w:r>
             <w:r>
               <w:rPr>
@@ -716,7 +716,7 @@
               <w:noProof/>
             </w:rPr>
           </w:pPr>
-          <w:hyperlink w:anchor="_Toc242986003" w:history="1">
+          <w:hyperlink w:anchor="_Toc242986194" w:history="1">
             <w:r>
               <w:rPr>
                 <w:rStyle w:val="Hyperlink"/>
@@ -740,7 +740,7 @@
               <w:rPr>
                 <w:noProof/>
               </w:rPr>
-              <w:instrText xml:space="preserve"> PAGEREF _Toc242986003 \h </w:instrText>
+              <w:instrText xml:space="preserve"> PAGEREF _Toc242986194 \h </w:instrText>
             </w:r>
             <w:r>
               <w:rPr>
@@ -777,7 +777,7 @@
               <w:noProof/>
             </w:rPr>
           </w:pPr>
-          <w:hyperlink w:anchor="_Toc242986004" w:history="1">
+          <w:hyperlink w:anchor="_Toc242986195" w:history="1">
             <w:r>
               <w:rPr>
                 <w:rStyle w:val="Hyperlink"/>
@@ -801,7 +801,7 @@
               <w:rPr>
                 <w:noProof/>
               </w:rPr>
-              <w:instrText xml:space="preserve"> PAGEREF _Toc242986004 \h </w:instrText>
+              <w:instrText xml:space="preserve"> PAGEREF _Toc242986195 \h </w:instrText>
             </w:r>
             <w:r>
               <w:rPr>
@@ -838,7 +838,7 @@
               <w:noProof/>
             </w:rPr>
           </w:pPr>
-          <w:hyperlink w:anchor="_Toc242986005" w:history="1">
+          <w:hyperlink w:anchor="_Toc242986196" w:history="1">
             <w:r>
               <w:rPr>
                 <w:rStyle w:val="Hyperlink"/>
@@ -862,7 +862,7 @@
               <w:rPr>
                 <w:noProof/>
               </w:rPr>
-              <w:instrText xml:space="preserve"> PAGEREF _Toc242986005 \h </w:instrText>
+              <w:instrText xml:space="preserve"> PAGEREF _Toc242986196 \h </w:instrText>
             </w:r>
             <w:r>
               <w:rPr>
@@ -899,7 +899,7 @@
               <w:noProof/>
             </w:rPr>
           </w:pPr>
-          <w:hyperlink w:anchor="_Toc242986006" w:history="1">
+          <w:hyperlink w:anchor="_Toc242986197" w:history="1">
             <w:r>
               <w:rPr>
                 <w:rStyle w:val="Hyperlink"/>
@@ -923,7 +923,7 @@
               <w:rPr>
                 <w:noProof/>
               </w:rPr>
-              <w:instrText xml:space="preserve"> PAGEREF _Toc242986006 \h </w:instrText>
+              <w:instrText xml:space="preserve"> PAGEREF _Toc242986197 \h </w:instrText>
             </w:r>
             <w:r>
               <w:rPr>
@@ -960,7 +960,7 @@
               <w:noProof/>
             </w:rPr>
           </w:pPr>
-          <w:hyperlink w:anchor="_Toc242986007" w:history="1">
+          <w:hyperlink w:anchor="_Toc242986198" w:history="1">
             <w:r>
               <w:rPr>
                 <w:rStyle w:val="Hyperlink"/>
@@ -984,7 +984,7 @@
               <w:rPr>
                 <w:noProof/>
               </w:rPr>
-              <w:instrText xml:space="preserve"> PAGEREF _Toc242986007 \h </w:instrText>
+              <w:instrText xml:space="preserve"> PAGEREF _Toc242986198 \h </w:instrText>
             </w:r>
             <w:r>
               <w:rPr>
@@ -1021,7 +1021,7 @@
               <w:noProof/>
             </w:rPr>
           </w:pPr>
-          <w:hyperlink w:anchor="_Toc242986008" w:history="1">
+          <w:hyperlink w:anchor="_Toc242986199" w:history="1">
             <w:r>
               <w:rPr>
                 <w:rStyle w:val="Hyperlink"/>
@@ -1045,7 +1045,7 @@
               <w:rPr>
                 <w:noProof/>
               </w:rPr>
-              <w:instrText xml:space="preserve"> PAGEREF _Toc242986008 \h </w:instrText>
+              <w:instrText xml:space="preserve"> PAGEREF _Toc242986199 \h </w:instrText>
             </w:r>
             <w:r>
               <w:rPr>
@@ -1082,7 +1082,7 @@
               <w:noProof/>
             </w:rPr>
           </w:pPr>
-          <w:hyperlink w:anchor="_Toc242986009" w:history="1">
+          <w:hyperlink w:anchor="_Toc242986200" w:history="1">
             <w:r>
               <w:rPr>
                 <w:rStyle w:val="Hyperlink"/>
@@ -1106,7 +1106,7 @@
               <w:rPr>
                 <w:noProof/>
               </w:rPr>
-              <w:instrText xml:space="preserve"> PAGEREF _Toc242986009 \h </w:instrText>
+              <w:instrText xml:space="preserve"> PAGEREF _Toc242986200 \h </w:instrText>
             </w:r>
             <w:r>
               <w:rPr>
@@ -1143,7 +1143,7 @@
               <w:noProof/>
             </w:rPr>
           </w:pPr>
-          <w:hyperlink w:anchor="_Toc242986010" w:history="1">
+          <w:hyperlink w:anchor="_Toc242986201" w:history="1">
             <w:r>
               <w:rPr>
                 <w:rStyle w:val="Hyperlink"/>
@@ -1167,7 +1167,7 @@
               <w:rPr>
                 <w:noProof/>
               </w:rPr>
-              <w:instrText xml:space="preserve"> PAGEREF _Toc242986010 \h </w:instrText>
+              <w:instrText xml:space="preserve"> PAGEREF _Toc242986201 \h </w:instrText>
             </w:r>
             <w:r>
               <w:rPr>
@@ -1204,7 +1204,7 @@
               <w:noProof/>
             </w:rPr>
           </w:pPr>
-          <w:hyperlink w:anchor="_Toc242986011" w:history="1">
+          <w:hyperlink w:anchor="_Toc242986202" w:history="1">
             <w:r>
               <w:rPr>
                 <w:rStyle w:val="Hyperlink"/>
@@ -1228,7 +1228,7 @@
               <w:rPr>
                 <w:noProof/>
               </w:rPr>
-              <w:instrText xml:space="preserve"> PAGEREF _Toc242986011 \h </w:instrText>
+              <w:instrText xml:space="preserve"> PAGEREF _Toc242986202 \h </w:instrText>
             </w:r>
             <w:r>
               <w:rPr>
@@ -1265,7 +1265,7 @@
               <w:noProof/>
             </w:rPr>
           </w:pPr>
-          <w:hyperlink w:anchor="_Toc242986012" w:history="1">
+          <w:hyperlink w:anchor="_Toc242986203" w:history="1">
             <w:r>
               <w:rPr>
                 <w:rStyle w:val="Hyperlink"/>
@@ -1289,7 +1289,7 @@
               <w:rPr>
                 <w:noProof/>
               </w:rPr>
-              <w:instrText xml:space="preserve"> PAGEREF _Toc242986012 \h </w:instrText>
+              <w:instrText xml:space="preserve"> PAGEREF _Toc242986203 \h </w:instrText>
             </w:r>
             <w:r>
               <w:rPr>
@@ -1326,7 +1326,7 @@
               <w:noProof/>
             </w:rPr>
           </w:pPr>
-          <w:hyperlink w:anchor="_Toc242986013" w:history="1">
+          <w:hyperlink w:anchor="_Toc242986204" w:history="1">
             <w:r>
               <w:rPr>
                 <w:rStyle w:val="Hyperlink"/>
@@ -1350,7 +1350,7 @@
               <w:rPr>
                 <w:noProof/>
               </w:rPr>
-              <w:instrText xml:space="preserve"> PAGEREF _Toc242986013 \h </w:instrText>
+              <w:instrText xml:space="preserve"> PAGEREF _Toc242986204 \h </w:instrText>
             </w:r>
             <w:r>
               <w:rPr>
@@ -1387,7 +1387,7 @@
               <w:noProof/>
             </w:rPr>
           </w:pPr>
-          <w:hyperlink w:anchor="_Toc242986014" w:history="1">
+          <w:hyperlink w:anchor="_Toc242986205" w:history="1">
             <w:r>
               <w:rPr>
                 <w:rStyle w:val="Hyperlink"/>
@@ -1411,7 +1411,7 @@
               <w:rPr>
                 <w:noProof/>
               </w:rPr>
-              <w:instrText xml:space="preserve"> PAGEREF _Toc242986014 \h </w:instrText>
+              <w:instrText xml:space="preserve"> PAGEREF _Toc242986205 \h </w:instrText>
             </w:r>
             <w:r>
               <w:rPr>
@@ -1448,7 +1448,7 @@
               <w:noProof/>
             </w:rPr>
           </w:pPr>
-          <w:hyperlink w:anchor="_Toc242986015" w:history="1">
+          <w:hyperlink w:anchor="_Toc242986206" w:history="1">
             <w:r>
               <w:rPr>
                 <w:rStyle w:val="Hyperlink"/>
@@ -1472,7 +1472,7 @@
               <w:rPr>
                 <w:noProof/>
               </w:rPr>
-              <w:instrText xml:space="preserve"> PAGEREF _Toc242986015 \h </w:instrText>
+              <w:instrText xml:space="preserve"> PAGEREF _Toc242986206 \h </w:instrText>
             </w:r>
             <w:r>
               <w:rPr>
@@ -1509,7 +1509,7 @@
               <w:noProof/>
             </w:rPr>
           </w:pPr>
-          <w:hyperlink w:anchor="_Toc242986016" w:history="1">
+          <w:hyperlink w:anchor="_Toc242986207" w:history="1">
             <w:r>
               <w:rPr>
                 <w:rStyle w:val="Hyperlink"/>
@@ -1533,7 +1533,7 @@
               <w:rPr>
                 <w:noProof/>
               </w:rPr>
-              <w:instrText xml:space="preserve"> PAGEREF _Toc242986016 \h </w:instrText>
+              <w:instrText xml:space="preserve"> PAGEREF _Toc242986207 \h </w:instrText>
             </w:r>
             <w:r>
               <w:rPr>
@@ -1570,7 +1570,7 @@
               <w:noProof/>
             </w:rPr>
           </w:pPr>
-          <w:hyperlink w:anchor="_Toc242986017" w:history="1">
+          <w:hyperlink w:anchor="_Toc242986208" w:history="1">
             <w:r>
               <w:rPr>
                 <w:rStyle w:val="Hyperlink"/>
@@ -1594,7 +1594,7 @@
               <w:rPr>
                 <w:noProof/>
               </w:rPr>
-              <w:instrText xml:space="preserve"> PAGEREF _Toc242986017 \h </w:instrText>
+              <w:instrText xml:space="preserve"> PAGEREF _Toc242986208 \h </w:instrText>
             </w:r>
             <w:r>
               <w:rPr>
@@ -1631,7 +1631,7 @@
               <w:noProof/>
             </w:rPr>
           </w:pPr>
-          <w:hyperlink w:anchor="_Toc242986018" w:history="1">
+          <w:hyperlink w:anchor="_Toc242986209" w:history="1">
             <w:r>
               <w:rPr>
                 <w:rStyle w:val="Hyperlink"/>
@@ -1655,7 +1655,7 @@
               <w:rPr>
                 <w:noProof/>
               </w:rPr>
-              <w:instrText xml:space="preserve"> PAGEREF _Toc242986018 \h </w:instrText>
+              <w:instrText xml:space="preserve"> PAGEREF _Toc242986209 \h </w:instrText>
             </w:r>
             <w:r>
               <w:rPr>
@@ -1692,7 +1692,7 @@
               <w:noProof/>
             </w:rPr>
           </w:pPr>
-          <w:hyperlink w:anchor="_Toc242986019" w:history="1">
+          <w:hyperlink w:anchor="_Toc242986210" w:history="1">
             <w:r>
               <w:rPr>
                 <w:rStyle w:val="Hyperlink"/>
@@ -1716,7 +1716,7 @@
               <w:rPr>
                 <w:noProof/>
               </w:rPr>
-              <w:instrText xml:space="preserve"> PAGEREF _Toc242986019 \h </w:instrText>
+              <w:instrText xml:space="preserve"> PAGEREF _Toc242986210 \h </w:instrText>
             </w:r>
             <w:r>
               <w:rPr>
@@ -1753,7 +1753,7 @@
               <w:noProof/>
             </w:rPr>
           </w:pPr>
-          <w:hyperlink w:anchor="_Toc242986020" w:history="1">
+          <w:hyperlink w:anchor="_Toc242986211" w:history="1">
             <w:r>
               <w:rPr>
                 <w:rStyle w:val="Hyperlink"/>
@@ -1777,7 +1777,7 @@
               <w:rPr>
                 <w:noProof/>
               </w:rPr>
-              <w:instrText xml:space="preserve"> PAGEREF _Toc242986020 \h </w:instrText>
+              <w:instrText xml:space="preserve"> PAGEREF _Toc242986211 \h </w:instrText>
             </w:r>
             <w:r>
               <w:rPr>
@@ -1814,7 +1814,7 @@
               <w:noProof/>
             </w:rPr>
           </w:pPr>
-          <w:hyperlink w:anchor="_Toc242986021" w:history="1">
+          <w:hyperlink w:anchor="_Toc242986212" w:history="1">
             <w:r>
               <w:rPr>
                 <w:rStyle w:val="Hyperlink"/>
@@ -1838,7 +1838,7 @@
               <w:rPr>
                 <w:noProof/>
               </w:rPr>
-              <w:instrText xml:space="preserve"> PAGEREF _Toc242986021 \h </w:instrText>
+              <w:instrText xml:space="preserve"> PAGEREF _Toc242986212 \h </w:instrText>
             </w:r>
             <w:r>
               <w:rPr>
@@ -1875,7 +1875,7 @@
               <w:noProof/>
             </w:rPr>
           </w:pPr>
-          <w:hyperlink w:anchor="_Toc242986022" w:history="1">
+          <w:hyperlink w:anchor="_Toc242986213" w:history="1">
             <w:r>
               <w:rPr>
                 <w:rStyle w:val="Hyperlink"/>
@@ -1899,7 +1899,7 @@
               <w:rPr>
                 <w:noProof/>
               </w:rPr>
-              <w:instrText xml:space="preserve"> PAGEREF _Toc242986022 \h </w:instrText>
+              <w:instrText xml:space="preserve"> PAGEREF _Toc242986213 \h </w:instrText>
             </w:r>
             <w:r>
               <w:rPr>
@@ -1936,7 +1936,7 @@
               <w:noProof/>
             </w:rPr>
           </w:pPr>
-          <w:hyperlink w:anchor="_Toc242986023" w:history="1">
+          <w:hyperlink w:anchor="_Toc242986214" w:history="1">
             <w:r>
               <w:rPr>
                 <w:rStyle w:val="Hyperlink"/>
@@ -1960,7 +1960,7 @@
               <w:rPr>
                 <w:noProof/>
               </w:rPr>
-              <w:instrText xml:space="preserve"> PAGEREF _Toc242986023 \h </w:instrText>
+              <w:instrText xml:space="preserve"> PAGEREF _Toc242986214 \h </w:instrText>
             </w:r>
             <w:r>
               <w:rPr>
@@ -1997,7 +1997,7 @@
               <w:noProof/>
             </w:rPr>
           </w:pPr>
-          <w:hyperlink w:anchor="_Toc242986024" w:history="1">
+          <w:hyperlink w:anchor="_Toc242986215" w:history="1">
             <w:r>
               <w:rPr>
                 <w:rStyle w:val="Hyperlink"/>
@@ -2021,7 +2021,7 @@
               <w:rPr>
                 <w:noProof/>
               </w:rPr>
-              <w:instrText xml:space="preserve"> PAGEREF _Toc242986024 \h </w:instrText>
+              <w:instrText xml:space="preserve"> PAGEREF _Toc242986215 \h </w:instrText>
             </w:r>
             <w:r>
               <w:rPr>
@@ -2058,7 +2058,7 @@
               <w:noProof/>
             </w:rPr>
           </w:pPr>
-          <w:hyperlink w:anchor="_Toc242986025" w:history="1">
+          <w:hyperlink w:anchor="_Toc242986216" w:history="1">
             <w:r>
               <w:rPr>
                 <w:rStyle w:val="Hyperlink"/>
@@ -2082,7 +2082,7 @@
               <w:rPr>
                 <w:noProof/>
               </w:rPr>
-              <w:instrText xml:space="preserve"> PAGEREF _Toc242986025 \h </w:instrText>
+              <w:instrText xml:space="preserve"> PAGEREF _Toc242986216 \h </w:instrText>
             </w:r>
             <w:r>
               <w:rPr>
@@ -2119,7 +2119,7 @@
               <w:noProof/>
             </w:rPr>
           </w:pPr>
-          <w:hyperlink w:anchor="_Toc242986026" w:history="1">
+          <w:hyperlink w:anchor="_Toc242986217" w:history="1">
             <w:r>
               <w:rPr>
                 <w:rStyle w:val="Hyperlink"/>
@@ -2143,7 +2143,7 @@
               <w:rPr>
                 <w:noProof/>
               </w:rPr>
-              <w:instrText xml:space="preserve"> PAGEREF _Toc242986026 \h </w:instrText>
+              <w:instrText xml:space="preserve"> PAGEREF _Toc242986217 \h </w:instrText>
             </w:r>
             <w:r>
               <w:rPr>
@@ -2180,7 +2180,7 @@
               <w:noProof/>
             </w:rPr>
           </w:pPr>
-          <w:hyperlink w:anchor="_Toc242986027" w:history="1">
+          <w:hyperlink w:anchor="_Toc242986218" w:history="1">
             <w:r>
               <w:rPr>
                 <w:rStyle w:val="Hyperlink"/>
@@ -2204,7 +2204,7 @@
               <w:rPr>
                 <w:noProof/>
               </w:rPr>
-              <w:instrText xml:space="preserve"> PAGEREF _Toc242986027 \h </w:instrText>
+              <w:instrText xml:space="preserve"> PAGEREF _Toc242986218 \h </w:instrText>
             </w:r>
             <w:r>
               <w:rPr>
@@ -2241,7 +2241,7 @@
               <w:noProof/>
             </w:rPr>
           </w:pPr>
-          <w:hyperlink w:anchor="_Toc242986028" w:history="1">
+          <w:hyperlink w:anchor="_Toc242986219" w:history="1">
             <w:r>
               <w:rPr>
                 <w:rStyle w:val="Hyperlink"/>
@@ -2265,7 +2265,7 @@
               <w:rPr>
                 <w:noProof/>
               </w:rPr>
-              <w:instrText xml:space="preserve"> PAGEREF _Toc242986028 \h </w:instrText>
+              <w:instrText xml:space="preserve"> PAGEREF _Toc242986219 \h </w:instrText>
             </w:r>
             <w:r>
               <w:rPr>
@@ -2302,7 +2302,7 @@
               <w:noProof/>
             </w:rPr>
           </w:pPr>
-          <w:hyperlink w:anchor="_Toc242986029" w:history="1">
+          <w:hyperlink w:anchor="_Toc242986220" w:history="1">
             <w:r>
               <w:rPr>
                 <w:rStyle w:val="Hyperlink"/>
@@ -2326,7 +2326,7 @@
               <w:rPr>
                 <w:noProof/>
               </w:rPr>
-              <w:instrText xml:space="preserve"> PAGEREF _Toc242986029 \h </w:instrText>
+              <w:instrText xml:space="preserve"> PAGEREF _Toc242986220 \h </w:instrText>
             </w:r>
             <w:r>
               <w:rPr>
@@ -2363,7 +2363,7 @@
               <w:noProof/>
             </w:rPr>
           </w:pPr>
-          <w:hyperlink w:anchor="_Toc242986030" w:history="1">
+          <w:hyperlink w:anchor="_Toc242986221" w:history="1">
             <w:r>
               <w:rPr>
                 <w:rStyle w:val="Hyperlink"/>
@@ -2387,7 +2387,7 @@
               <w:rPr>
                 <w:noProof/>
               </w:rPr>
-              <w:instrText xml:space="preserve"> PAGEREF _Toc242986030 \h </w:instrText>
+              <w:instrText xml:space="preserve"> PAGEREF _Toc242986221 \h </w:instrText>
             </w:r>
             <w:r>
               <w:rPr>
@@ -2424,7 +2424,7 @@
               <w:noProof/>
             </w:rPr>
           </w:pPr>
-          <w:hyperlink w:anchor="_Toc242986031" w:history="1">
+          <w:hyperlink w:anchor="_Toc242986222" w:history="1">
             <w:r>
               <w:rPr>
                 <w:rStyle w:val="Hyperlink"/>
@@ -2448,7 +2448,7 @@
               <w:rPr>
                 <w:noProof/>
               </w:rPr>
-              <w:instrText xml:space="preserve"> PAGEREF _Toc242986031 \h </w:instrText>
+              <w:instrText xml:space="preserve"> PAGEREF _Toc242986222 \h </w:instrText>
             </w:r>
             <w:r>
               <w:rPr>
@@ -2485,7 +2485,7 @@
               <w:noProof/>
             </w:rPr>
           </w:pPr>
-          <w:hyperlink w:anchor="_Toc242986032" w:history="1">
+          <w:hyperlink w:anchor="_Toc242986223" w:history="1">
             <w:r>
               <w:rPr>
                 <w:rStyle w:val="Hyperlink"/>
@@ -2509,7 +2509,7 @@
               <w:rPr>
                 <w:noProof/>
               </w:rPr>
-              <w:instrText xml:space="preserve"> PAGEREF _Toc242986032 \h </w:instrText>
+              <w:instrText xml:space="preserve"> PAGEREF _Toc242986223 \h </w:instrText>
             </w:r>
             <w:r>
               <w:rPr>
@@ -2546,7 +2546,7 @@
               <w:noProof/>
             </w:rPr>
           </w:pPr>
-          <w:hyperlink w:anchor="_Toc242986033" w:history="1">
+          <w:hyperlink w:anchor="_Toc242986224" w:history="1">
             <w:r>
               <w:rPr>
                 <w:rStyle w:val="Hyperlink"/>
@@ -2570,7 +2570,7 @@
               <w:rPr>
                 <w:noProof/>
               </w:rPr>
-              <w:instrText xml:space="preserve"> PAGEREF _Toc242986033 \h </w:instrText>
+              <w:instrText xml:space="preserve"> PAGEREF _Toc242986224 \h </w:instrText>
             </w:r>
             <w:r>
               <w:rPr>
@@ -2607,7 +2607,7 @@
               <w:noProof/>
             </w:rPr>
           </w:pPr>
-          <w:hyperlink w:anchor="_Toc242986034" w:history="1">
+          <w:hyperlink w:anchor="_Toc242986225" w:history="1">
             <w:r>
               <w:rPr>
                 <w:rStyle w:val="Hyperlink"/>
@@ -2631,7 +2631,7 @@
               <w:rPr>
                 <w:noProof/>
               </w:rPr>
-              <w:instrText xml:space="preserve"> PAGEREF _Toc242986034 \h </w:instrText>
+              <w:instrText xml:space="preserve"> PAGEREF _Toc242986225 \h </w:instrText>
             </w:r>
             <w:r>
               <w:rPr>
@@ -2668,7 +2668,7 @@
               <w:noProof/>
             </w:rPr>
           </w:pPr>
-          <w:hyperlink w:anchor="_Toc242986035" w:history="1">
+          <w:hyperlink w:anchor="_Toc242986226" w:history="1">
             <w:r>
               <w:rPr>
                 <w:rStyle w:val="Hyperlink"/>
@@ -2692,7 +2692,7 @@
               <w:rPr>
                 <w:noProof/>
               </w:rPr>
-              <w:instrText xml:space="preserve"> PAGEREF _Toc242986035 \h </w:instrText>
+              <w:instrText xml:space="preserve"> PAGEREF _Toc242986226 \h </w:instrText>
             </w:r>
             <w:r>
               <w:rPr>
@@ -2729,7 +2729,7 @@
               <w:noProof/>
             </w:rPr>
           </w:pPr>
-          <w:hyperlink w:anchor="_Toc242986036" w:history="1">
+          <w:hyperlink w:anchor="_Toc242986227" w:history="1">
             <w:r>
               <w:rPr>
                 <w:rStyle w:val="Hyperlink"/>
@@ -2753,7 +2753,7 @@
               <w:rPr>
                 <w:noProof/>
               </w:rPr>
-              <w:instrText xml:space="preserve"> PAGEREF _Toc242986036 \h </w:instrText>
+              <w:instrText xml:space="preserve"> PAGEREF _Toc242986227 \h </w:instrText>
             </w:r>
             <w:r>
               <w:rPr>
@@ -2790,7 +2790,7 @@
               <w:noProof/>
             </w:rPr>
           </w:pPr>
-          <w:hyperlink w:anchor="_Toc242986037" w:history="1">
+          <w:hyperlink w:anchor="_Toc242986228" w:history="1">
             <w:r>
               <w:rPr>
                 <w:rStyle w:val="Hyperlink"/>
@@ -2814,7 +2814,7 @@
               <w:rPr>
                 <w:noProof/>
               </w:rPr>
-              <w:instrText xml:space="preserve"> PAGEREF _Toc242986037 \h </w:instrText>
+              <w:instrText xml:space="preserve"> PAGEREF _Toc242986228 \h </w:instrText>
             </w:r>
             <w:r>
               <w:rPr>
@@ -2851,7 +2851,7 @@
               <w:noProof/>
             </w:rPr>
           </w:pPr>
-          <w:hyperlink w:anchor="_Toc242986038" w:history="1">
+          <w:hyperlink w:anchor="_Toc242986229" w:history="1">
             <w:r>
               <w:rPr>
                 <w:rStyle w:val="Hyperlink"/>
@@ -2875,7 +2875,7 @@
               <w:rPr>
                 <w:noProof/>
               </w:rPr>
-              <w:instrText xml:space="preserve"> PAGEREF _Toc242986038 \h </w:instrText>
+              <w:instrText xml:space="preserve"> PAGEREF _Toc242986229 \h </w:instrText>
             </w:r>
             <w:r>
               <w:rPr>
@@ -2912,7 +2912,7 @@
               <w:noProof/>
             </w:rPr>
           </w:pPr>
-          <w:hyperlink w:anchor="_Toc242986039" w:history="1">
+          <w:hyperlink w:anchor="_Toc242986230" w:history="1">
             <w:r>
               <w:rPr>
                 <w:rStyle w:val="Hyperlink"/>
@@ -2936,7 +2936,7 @@
               <w:rPr>
                 <w:noProof/>
               </w:rPr>
-              <w:instrText xml:space="preserve"> PAGEREF _Toc242986039 \h </w:instrText>
+              <w:instrText xml:space="preserve"> PAGEREF _Toc242986230 \h </w:instrText>
             </w:r>
             <w:r>
               <w:rPr>
@@ -2973,7 +2973,7 @@
               <w:noProof/>
             </w:rPr>
           </w:pPr>
-          <w:hyperlink w:anchor="_Toc242986040" w:history="1">
+          <w:hyperlink w:anchor="_Toc242986231" w:history="1">
             <w:r>
               <w:rPr>
                 <w:rStyle w:val="Hyperlink"/>
@@ -2997,7 +2997,7 @@
               <w:rPr>
                 <w:noProof/>
               </w:rPr>
-              <w:instrText xml:space="preserve"> PAGEREF _Toc242986040 \h </w:instrText>
+              <w:instrText xml:space="preserve"> PAGEREF _Toc242986231 \h </w:instrText>
             </w:r>
             <w:r>
               <w:rPr>
@@ -3034,7 +3034,7 @@
               <w:noProof/>
             </w:rPr>
           </w:pPr>
-          <w:hyperlink w:anchor="_Toc242986041" w:history="1">
+          <w:hyperlink w:anchor="_Toc242986232" w:history="1">
             <w:r>
               <w:rPr>
                 <w:rStyle w:val="Hyperlink"/>
@@ -3058,7 +3058,7 @@
               <w:rPr>
                 <w:noProof/>
               </w:rPr>
-              <w:instrText xml:space="preserve"> PAGEREF _Toc242986041 \h </w:instrText>
+              <w:instrText xml:space="preserve"> PAGEREF _Toc242986232 \h </w:instrText>
             </w:r>
             <w:r>
               <w:rPr>
@@ -3095,7 +3095,7 @@
               <w:noProof/>
             </w:rPr>
           </w:pPr>
-          <w:hyperlink w:anchor="_Toc242986042" w:history="1">
+          <w:hyperlink w:anchor="_Toc242986233" w:history="1">
             <w:r>
               <w:rPr>
                 <w:rStyle w:val="Hyperlink"/>
@@ -3119,7 +3119,7 @@
               <w:rPr>
                 <w:noProof/>
               </w:rPr>
-              <w:instrText xml:space="preserve"> PAGEREF _Toc242986042 \h </w:instrText>
+              <w:instrText xml:space="preserve"> PAGEREF _Toc242986233 \h </w:instrText>
             </w:r>
             <w:r>
               <w:rPr>
@@ -3156,7 +3156,7 @@
               <w:noProof/>
             </w:rPr>
           </w:pPr>
-          <w:hyperlink w:anchor="_Toc242986043" w:history="1">
+          <w:hyperlink w:anchor="_Toc242986234" w:history="1">
             <w:r>
               <w:rPr>
                 <w:rStyle w:val="Hyperlink"/>
@@ -3180,7 +3180,7 @@
               <w:rPr>
                 <w:noProof/>
               </w:rPr>
-              <w:instrText xml:space="preserve"> PAGEREF _Toc242986043 \h </w:instrText>
+              <w:instrText xml:space="preserve"> PAGEREF _Toc242986234 \h </w:instrText>
             </w:r>
             <w:r>
               <w:rPr>
@@ -3217,7 +3217,7 @@
               <w:noProof/>
             </w:rPr>
           </w:pPr>
-          <w:hyperlink w:anchor="_Toc242986044" w:history="1">
+          <w:hyperlink w:anchor="_Toc242986235" w:history="1">
             <w:r>
               <w:rPr>
                 <w:rStyle w:val="Hyperlink"/>
@@ -3241,7 +3241,7 @@
               <w:rPr>
                 <w:noProof/>
               </w:rPr>
-              <w:instrText xml:space="preserve"> PAGEREF _Toc242986044 \h </w:instrText>
+              <w:instrText xml:space="preserve"> PAGEREF _Toc242986235 \h </w:instrText>
             </w:r>
             <w:r>
               <w:rPr>
@@ -3278,7 +3278,7 @@
               <w:noProof/>
             </w:rPr>
           </w:pPr>
-          <w:hyperlink w:anchor="_Toc242986045" w:history="1">
+          <w:hyperlink w:anchor="_Toc242986236" w:history="1">
             <w:r>
               <w:rPr>
                 <w:rStyle w:val="Hyperlink"/>
@@ -3302,7 +3302,7 @@
               <w:rPr>
                 <w:noProof/>
               </w:rPr>
-              <w:instrText xml:space="preserve"> PAGEREF _Toc242986045 \h </w:instrText>
+              <w:instrText xml:space="preserve"> PAGEREF _Toc242986236 \h </w:instrText>
             </w:r>
             <w:r>
               <w:rPr>
@@ -3341,7 +3341,7 @@
         <w:pStyle w:val="Heading1"/>
         <w:pageBreakBefore/>
       </w:pPr>
-      <w:bookmarkStart w:id="1" w:name="_Toc242986002"/>
+      <w:bookmarkStart w:id="1" w:name="_Toc242986193"/>
       <w:r>
         <w:lastRenderedPageBreak/>
         <w:t>1. Introduction</w:t>
@@ -3352,7 +3352,7 @@
       <w:pPr>
         <w:pStyle w:val="Heading2"/>
       </w:pPr>
-      <w:bookmarkStart w:id="2" w:name="_Toc242986003"/>
+      <w:bookmarkStart w:id="2" w:name="_Toc242986194"/>
       <w:r>
         <w:t>1.1 Problem statement</w:t>
       </w:r>
@@ -3380,7 +3380,7 @@
       <w:pPr>
         <w:pStyle w:val="Heading2"/>
       </w:pPr>
-      <w:bookmarkStart w:id="3" w:name="_Toc242986004"/>
+      <w:bookmarkStart w:id="3" w:name="_Toc242986195"/>
       <w:r>
         <w:t>1.2 Objectives</w:t>
       </w:r>
@@ -4544,7 +4544,7 @@
       <w:pPr>
         <w:pStyle w:val="Heading2"/>
       </w:pPr>
-      <w:bookmarkStart w:id="4" w:name="_Toc242986005"/>
+      <w:bookmarkStart w:id="4" w:name="_Toc242986196"/>
       <w:r>
         <w:t>1.3 Why big data is needed</w:t>
       </w:r>
@@ -5183,7 +5183,7 @@
       <w:pPr>
         <w:pStyle w:val="Heading1"/>
       </w:pPr>
-      <w:bookmarkStart w:id="5" w:name="_Toc242986006"/>
+      <w:bookmarkStart w:id="5" w:name="_Toc242986197"/>
       <w:r>
         <w:t>2. Literature Survey and Gap</w:t>
       </w:r>
@@ -5230,7 +5230,7 @@
         <w:pStyle w:val="Heading1"/>
         <w:pageBreakBefore/>
       </w:pPr>
-      <w:bookmarkStart w:id="6" w:name="_Toc242986007"/>
+      <w:bookmarkStart w:id="6" w:name="_Toc242986198"/>
       <w:r>
         <w:lastRenderedPageBreak/>
         <w:t>3. Dataset</w:t>
@@ -5241,7 +5241,7 @@
       <w:pPr>
         <w:pStyle w:val="Heading2"/>
       </w:pPr>
-      <w:bookmarkStart w:id="7" w:name="_Toc242986008"/>
+      <w:bookmarkStart w:id="7" w:name="_Toc242986199"/>
       <w:r>
         <w:t>3.1 The three data layers</w:t>
       </w:r>
@@ -6861,7 +6861,7 @@
       <w:pPr>
         <w:pStyle w:val="Heading2"/>
       </w:pPr>
-      <w:bookmarkStart w:id="8" w:name="_Toc242986009"/>
+      <w:bookmarkStart w:id="8" w:name="_Toc242986200"/>
       <w:r>
         <w:t>3.2 Key attributes</w:t>
       </w:r>
@@ -6963,7 +6963,7 @@
       <w:pPr>
         <w:pStyle w:val="Heading2"/>
       </w:pPr>
-      <w:bookmarkStart w:id="9" w:name="_Toc242986010"/>
+      <w:bookmarkStart w:id="9" w:name="_Toc242986201"/>
       <w:r>
         <w:t>3.3 The CAMS coverage finding</w:t>
       </w:r>
@@ -6992,7 +6992,7 @@
       <w:pPr>
         <w:pStyle w:val="Heading2"/>
       </w:pPr>
-      <w:bookmarkStart w:id="10" w:name="_Toc242986011"/>
+      <w:bookmarkStart w:id="10" w:name="_Toc242986202"/>
       <w:r>
         <w:t>3.4 Synthetic expansion and its validation (veracity)</w:t>
       </w:r>
@@ -7636,7 +7636,7 @@
       <w:pPr>
         <w:pStyle w:val="Heading2"/>
       </w:pPr>
-      <w:bookmarkStart w:id="11" w:name="_Toc242986012"/>
+      <w:bookmarkStart w:id="11" w:name="_Toc242986203"/>
       <w:r>
         <w:t>3.5 Live feed</w:t>
       </w:r>
@@ -7658,7 +7658,7 @@
       <w:pPr>
         <w:pStyle w:val="Heading2"/>
       </w:pPr>
-      <w:bookmarkStart w:id="12" w:name="_Toc242986013"/>
+      <w:bookmarkStart w:id="12" w:name="_Toc242986204"/>
       <w:r>
         <w:t>3.6 The five V's demonstrated</w:t>
       </w:r>
@@ -7687,7 +7687,7 @@
         <w:pStyle w:val="Heading1"/>
         <w:pageBreakBefore/>
       </w:pPr>
-      <w:bookmarkStart w:id="13" w:name="_Toc242986014"/>
+      <w:bookmarkStart w:id="13" w:name="_Toc242986205"/>
       <w:r>
         <w:lastRenderedPageBreak/>
         <w:t>4. System Architecture</w:t>
@@ -7717,7 +7717,7 @@
           <w:noProof/>
         </w:rPr>
         <w:drawing>
-          <wp:inline distT="0" distB="0" distL="0" distR="0" wp14:anchorId="6DAC4DF2" wp14:editId="063734A7">
+          <wp:inline distT="0" distB="0" distL="0" distR="0" wp14:anchorId="5921B3B7" wp14:editId="7CF86764">
             <wp:extent cx="5715000" cy="3219450"/>
             <wp:effectExtent l="0" t="0" r="0" b="0"/>
             <wp:docPr id="1" name="fig1" descr="System architecture: sources, ingest, HDFS storage, Spark on YARN (batch and speed layers), serving and alerting" title="System architecture: sources, ingest, HDFS storage, Spark on YARN (batch and speed layers), serving and alerting"/>
@@ -8681,7 +8681,7 @@
         <w:pStyle w:val="Heading1"/>
         <w:pageBreakBefore/>
       </w:pPr>
-      <w:bookmarkStart w:id="14" w:name="_Toc242986015"/>
+      <w:bookmarkStart w:id="14" w:name="_Toc242986206"/>
       <w:r>
         <w:lastRenderedPageBreak/>
         <w:t>5. Implementation</w:t>
@@ -8692,7 +8692,7 @@
       <w:pPr>
         <w:pStyle w:val="Heading2"/>
       </w:pPr>
-      <w:bookmarkStart w:id="15" w:name="_Toc242986016"/>
+      <w:bookmarkStart w:id="15" w:name="_Toc242986207"/>
       <w:r>
         <w:t>5.1 HDFS cluster</w:t>
       </w:r>
@@ -8721,7 +8721,7 @@
           <w:noProof/>
         </w:rPr>
         <w:drawing>
-          <wp:inline distT="0" distB="0" distL="0" distR="0" wp14:anchorId="0EEBA856" wp14:editId="01A5B187">
+          <wp:inline distT="0" distB="0" distL="0" distR="0" wp14:anchorId="60A36774" wp14:editId="77C4BE5B">
             <wp:extent cx="5334000" cy="1362075"/>
             <wp:effectExtent l="0" t="0" r="0" b="0"/>
             <wp:docPr id="2" name="fig2" descr="dfsadmin report: 4 live DataNodes" title="dfsadmin report: 4 live DataNodes"/>
@@ -8787,7 +8787,7 @@
           <w:noProof/>
         </w:rPr>
         <w:drawing>
-          <wp:inline distT="0" distB="0" distL="0" distR="0" wp14:anchorId="4C984A0E" wp14:editId="095DD5E7">
+          <wp:inline distT="0" distB="0" distL="0" distR="0" wp14:anchorId="51C79481" wp14:editId="709904FB">
             <wp:extent cx="4191000" cy="3038475"/>
             <wp:effectExtent l="0" t="0" r="0" b="0"/>
             <wp:docPr id="3" name="fig3" descr="fsck of the raw layer: HEALTHY, 232 blocks, replication 3.0, 0 missing / corrupt" title="fsck of the raw layer: HEALTHY, 232 blocks, replication 3.0, 0 missing / corrupt"/>
@@ -8846,7 +8846,7 @@
       <w:pPr>
         <w:pStyle w:val="Heading2"/>
       </w:pPr>
-      <w:bookmarkStart w:id="16" w:name="_Toc242986017"/>
+      <w:bookmarkStart w:id="16" w:name="_Toc242986208"/>
       <w:r>
         <w:t>5.2 YARN and Spark</w:t>
       </w:r>
@@ -8876,7 +8876,7 @@
         </w:rPr>
         <w:lastRenderedPageBreak/>
         <w:drawing>
-          <wp:inline distT="0" distB="0" distL="0" distR="0" wp14:anchorId="6FE3C38D" wp14:editId="0FD1E0C0">
+          <wp:inline distT="0" distB="0" distL="0" distR="0" wp14:anchorId="39611582" wp14:editId="5C82EDAC">
             <wp:extent cx="4191000" cy="2181225"/>
             <wp:effectExtent l="0" t="0" r="0" b="0"/>
             <wp:docPr id="4" name="fig4" descr="HDFS NameNode UI: DataNodes in service" title="HDFS NameNode UI: DataNodes in service"/>
@@ -8942,7 +8942,7 @@
           <w:noProof/>
         </w:rPr>
         <w:drawing>
-          <wp:inline distT="0" distB="0" distL="0" distR="0" wp14:anchorId="01A7E837" wp14:editId="21843DE1">
+          <wp:inline distT="0" distB="0" distL="0" distR="0" wp14:anchorId="25E4CA56" wp14:editId="5532F977">
             <wp:extent cx="4762500" cy="2314575"/>
             <wp:effectExtent l="0" t="0" r="0" b="0"/>
             <wp:docPr id="5" name="fig5" descr="YARN ResourceManager: four NodeManagers, all RUNNING" title="YARN ResourceManager: four NodeManagers, all RUNNING"/>
@@ -9008,7 +9008,7 @@
           <w:noProof/>
         </w:rPr>
         <w:drawing>
-          <wp:inline distT="0" distB="0" distL="0" distR="0" wp14:anchorId="6946A78B" wp14:editId="56967DC9">
+          <wp:inline distT="0" distB="0" distL="0" distR="0" wp14:anchorId="1F993B3A" wp14:editId="5481D040">
             <wp:extent cx="5334000" cy="1495425"/>
             <wp:effectExtent l="0" t="0" r="0" b="0"/>
             <wp:docPr id="6" name="fig6" descr="YARN applications: the Spark recount job, FINISHED / SUCCEEDED" title="YARN applications: the Spark recount job, FINISHED / SUCCEEDED"/>
@@ -9067,7 +9067,7 @@
       <w:pPr>
         <w:pStyle w:val="Heading2"/>
       </w:pPr>
-      <w:bookmarkStart w:id="17" w:name="_Toc242986018"/>
+      <w:bookmarkStart w:id="17" w:name="_Toc242986209"/>
       <w:r>
         <w:t>5.3 Preprocessing (CleanSelect.scala)</w:t>
       </w:r>
@@ -10437,7 +10437,7 @@
           <w:noProof/>
         </w:rPr>
         <w:drawing>
-          <wp:inline distT="0" distB="0" distL="0" distR="0" wp14:anchorId="66647AF5" wp14:editId="37CDFB45">
+          <wp:inline distT="0" distB="0" distL="0" distR="0" wp14:anchorId="131EF93A" wp14:editId="264BCE9C">
             <wp:extent cx="4191000" cy="2371725"/>
             <wp:effectExtent l="0" t="0" r="0" b="0"/>
             <wp:docPr id="7" name="fig7" descr="CleanSelect at full scale: 146,276,379 rows in, 146,276,379 out" title="CleanSelect at full scale: 146,276,379 rows in, 146,276,379 out"/>
@@ -10504,7 +10504,7 @@
         </w:rPr>
         <w:lastRenderedPageBreak/>
         <w:drawing>
-          <wp:inline distT="0" distB="0" distL="0" distR="0" wp14:anchorId="742D5FFA" wp14:editId="0BC7F8D4">
+          <wp:inline distT="0" distB="0" distL="0" distR="0" wp14:anchorId="4541F46A" wp14:editId="0E4A53C3">
             <wp:extent cx="4000500" cy="3657600"/>
             <wp:effectExtent l="0" t="0" r="0" b="0"/>
             <wp:docPr id="8" name="fig8" descr="Processed layer in HDFS: one directory per city (241)" title="Processed layer in HDFS: one directory per city (241)"/>
@@ -10563,7 +10563,7 @@
       <w:pPr>
         <w:pStyle w:val="Heading2"/>
       </w:pPr>
-      <w:bookmarkStart w:id="18" w:name="_Toc242986019"/>
+      <w:bookmarkStart w:id="18" w:name="_Toc242986210"/>
       <w:r>
         <w:t>5.4 Spark workflow: DAG, partitioning and caching</w:t>
       </w:r>
@@ -11483,7 +11483,7 @@
       <w:pPr>
         <w:pStyle w:val="Heading2"/>
       </w:pPr>
-      <w:bookmarkStart w:id="19" w:name="_Toc242986020"/>
+      <w:bookmarkStart w:id="19" w:name="_Toc242986211"/>
       <w:r>
         <w:lastRenderedPageBreak/>
         <w:t>5.5 Feature engineering (FeatureExtraction.scala)</w:t>
@@ -11633,7 +11633,7 @@
       <w:pPr>
         <w:pStyle w:val="Heading2"/>
       </w:pPr>
-      <w:bookmarkStart w:id="20" w:name="_Toc242986021"/>
+      <w:bookmarkStart w:id="20" w:name="_Toc242986212"/>
       <w:r>
         <w:t>5.6 The forecasting model</w:t>
       </w:r>
@@ -12706,7 +12706,7 @@
       <w:pPr>
         <w:pStyle w:val="Heading2"/>
       </w:pPr>
-      <w:bookmarkStart w:id="21" w:name="_Toc242986022"/>
+      <w:bookmarkStart w:id="21" w:name="_Toc242986213"/>
       <w:r>
         <w:t>5.7 Live enrichment (LiveEnrichment.scala)</w:t>
       </w:r>
@@ -12746,7 +12746,7 @@
       <w:pPr>
         <w:pStyle w:val="Heading2"/>
       </w:pPr>
-      <w:bookmarkStart w:id="22" w:name="_Toc242986023"/>
+      <w:bookmarkStart w:id="22" w:name="_Toc242986214"/>
       <w:r>
         <w:t>5.8 Structured Streaming speed layer (AirQualityStream.scala)</w:t>
       </w:r>
@@ -12863,7 +12863,7 @@
       <w:pPr>
         <w:pStyle w:val="Heading2"/>
       </w:pPr>
-      <w:bookmarkStart w:id="23" w:name="_Toc242986024"/>
+      <w:bookmarkStart w:id="23" w:name="_Toc242986215"/>
       <w:r>
         <w:t>5.9 Alert engine and delivery</w:t>
       </w:r>
@@ -12910,7 +12910,7 @@
       <w:pPr>
         <w:pStyle w:val="Heading2"/>
       </w:pPr>
-      <w:bookmarkStart w:id="24" w:name="_Toc242986025"/>
+      <w:bookmarkStart w:id="24" w:name="_Toc242986216"/>
       <w:r>
         <w:t>5.10 Hive serving layer</w:t>
       </w:r>
@@ -12932,7 +12932,7 @@
       <w:pPr>
         <w:pStyle w:val="Heading2"/>
       </w:pPr>
-      <w:bookmarkStart w:id="25" w:name="_Toc242986026"/>
+      <w:bookmarkStart w:id="25" w:name="_Toc242986217"/>
       <w:r>
         <w:t>5.11 Public warning board</w:t>
       </w:r>
@@ -12961,7 +12961,7 @@
           <w:noProof/>
         </w:rPr>
         <w:drawing>
-          <wp:inline distT="0" distB="0" distL="0" distR="0" wp14:anchorId="11A18C00" wp14:editId="7D848B34">
+          <wp:inline distT="0" distB="0" distL="0" distR="0" wp14:anchorId="547C1DBB" wp14:editId="388D6A1F">
             <wp:extent cx="4572000" cy="3743325"/>
             <wp:effectExtent l="0" t="0" r="0" b="0"/>
             <wp:docPr id="9" name="fig9" descr="Public warning board (October 1–15, 2026 run): 221 cities under warning" title="Public warning board (October 1–15, 2026 run): 221 cities under warning"/>
@@ -13021,7 +13021,7 @@
         <w:pStyle w:val="Heading1"/>
         <w:pageBreakBefore/>
       </w:pPr>
-      <w:bookmarkStart w:id="26" w:name="_Toc242986027"/>
+      <w:bookmarkStart w:id="26" w:name="_Toc242986218"/>
       <w:r>
         <w:lastRenderedPageBreak/>
         <w:t>6. Results</w:t>
@@ -13032,7 +13032,7 @@
       <w:pPr>
         <w:pStyle w:val="Heading2"/>
       </w:pPr>
-      <w:bookmarkStart w:id="27" w:name="_Toc242986028"/>
+      <w:bookmarkStart w:id="27" w:name="_Toc242986219"/>
       <w:r>
         <w:t>6.1 Forecast accuracy</w:t>
       </w:r>
@@ -13901,7 +13901,7 @@
           <w:noProof/>
         </w:rPr>
         <w:drawing>
-          <wp:inline distT="0" distB="0" distL="0" distR="0" wp14:anchorId="60DD345D" wp14:editId="212EB1F9">
+          <wp:inline distT="0" distB="0" distL="0" distR="0" wp14:anchorId="242D0347" wp14:editId="6DE3705D">
             <wp:extent cx="3619500" cy="2362200"/>
             <wp:effectExtent l="0" t="0" r="0" b="0"/>
             <wp:docPr id="10" name="fig10" descr="RMSE of the persistence baseline and the GBT on real rows" title="RMSE of the persistence baseline and the GBT on real rows"/>
@@ -13960,7 +13960,7 @@
       <w:pPr>
         <w:pStyle w:val="Heading2"/>
       </w:pPr>
-      <w:bookmarkStart w:id="28" w:name="_Toc242986029"/>
+      <w:bookmarkStart w:id="28" w:name="_Toc242986220"/>
       <w:r>
         <w:t>6.2 Model comparison and tuning</w:t>
       </w:r>
@@ -14412,7 +14412,7 @@
       <w:pPr>
         <w:pStyle w:val="Heading2"/>
       </w:pPr>
-      <w:bookmarkStart w:id="29" w:name="_Toc242986030"/>
+      <w:bookmarkStart w:id="29" w:name="_Toc242986221"/>
       <w:r>
         <w:lastRenderedPageBreak/>
         <w:t>6.3 What the model learned</w:t>
@@ -14442,7 +14442,7 @@
           <w:noProof/>
         </w:rPr>
         <w:drawing>
-          <wp:inline distT="0" distB="0" distL="0" distR="0" wp14:anchorId="176E5D4C" wp14:editId="7FFDFD27">
+          <wp:inline distT="0" distB="0" distL="0" distR="0" wp14:anchorId="495A9B1E" wp14:editId="33FDA724">
             <wp:extent cx="4476750" cy="2657475"/>
             <wp:effectExtent l="0" t="0" r="0" b="0"/>
             <wp:docPr id="11" name="fig11" descr="Top-10 feature importances of the trained GBT" title="Top-10 feature importances of the trained GBT"/>
@@ -14501,7 +14501,7 @@
       <w:pPr>
         <w:pStyle w:val="Heading2"/>
       </w:pPr>
-      <w:bookmarkStart w:id="30" w:name="_Toc242986031"/>
+      <w:bookmarkStart w:id="30" w:name="_Toc242986222"/>
       <w:r>
         <w:t>6.4 Streaming performance</w:t>
       </w:r>
@@ -14530,7 +14530,7 @@
           <w:noProof/>
         </w:rPr>
         <w:drawing>
-          <wp:inline distT="0" distB="0" distL="0" distR="0" wp14:anchorId="4DE5CB7C" wp14:editId="03BC39E1">
+          <wp:inline distT="0" distB="0" distL="0" distR="0" wp14:anchorId="2501D05E" wp14:editId="51A37A24">
             <wp:extent cx="3810000" cy="2343150"/>
             <wp:effectExtent l="0" t="0" r="0" b="0"/>
             <wp:docPr id="12" name="fig12" descr="Latency per micro-batch" title="Latency per micro-batch"/>
@@ -14589,7 +14589,7 @@
       <w:pPr>
         <w:pStyle w:val="Heading2"/>
       </w:pPr>
-      <w:bookmarkStart w:id="31" w:name="_Toc242986032"/>
+      <w:bookmarkStart w:id="31" w:name="_Toc242986223"/>
       <w:r>
         <w:t>6.5 October 2026 live run</w:t>
       </w:r>
@@ -14619,7 +14619,7 @@
         </w:rPr>
         <w:lastRenderedPageBreak/>
         <w:drawing>
-          <wp:inline distT="0" distB="0" distL="0" distR="0" wp14:anchorId="67051A71" wp14:editId="49D4599C">
+          <wp:inline distT="0" distB="0" distL="0" distR="0" wp14:anchorId="0791A8AC" wp14:editId="7A00900B">
             <wp:extent cx="5143500" cy="2286000"/>
             <wp:effectExtent l="0" t="0" r="0" b="0"/>
             <wp:docPr id="13" name="fig13" descr="October 2026 warnings by CPCB severity and by dominant pollutant" title="October 2026 warnings by CPCB severity and by dominant pollutant"/>
@@ -14678,7 +14678,7 @@
       <w:pPr>
         <w:pStyle w:val="Heading2"/>
       </w:pPr>
-      <w:bookmarkStart w:id="32" w:name="_Toc242986033"/>
+      <w:bookmarkStart w:id="32" w:name="_Toc242986224"/>
       <w:r>
         <w:t>6.6 Seasonality</w:t>
       </w:r>
@@ -14707,7 +14707,7 @@
           <w:noProof/>
         </w:rPr>
         <w:drawing>
-          <wp:inline distT="0" distB="0" distL="0" distR="0" wp14:anchorId="727E9979" wp14:editId="7DD2B50F">
+          <wp:inline distT="0" distB="0" distL="0" distR="0" wp14:anchorId="02A2F3BB" wp14:editId="406CF89E">
             <wp:extent cx="4381500" cy="2257425"/>
             <wp:effectExtent l="0" t="0" r="0" b="0"/>
             <wp:docPr id="14" name="fig14" descr="Delhi monthly mean PM2.5, measured values only (Hive query)" title="Delhi monthly mean PM2.5, measured values only (Hive query)"/>
@@ -14766,7 +14766,7 @@
       <w:pPr>
         <w:pStyle w:val="Heading2"/>
       </w:pPr>
-      <w:bookmarkStart w:id="33" w:name="_Toc242986034"/>
+      <w:bookmarkStart w:id="33" w:name="_Toc242986225"/>
       <w:r>
         <w:t>6.7 Business insight</w:t>
       </w:r>
@@ -14825,7 +14825,7 @@
         <w:pStyle w:val="Heading1"/>
         <w:pageBreakBefore/>
       </w:pPr>
-      <w:bookmarkStart w:id="34" w:name="_Toc242986035"/>
+      <w:bookmarkStart w:id="34" w:name="_Toc242986226"/>
       <w:r>
         <w:lastRenderedPageBreak/>
         <w:t>7. Validation and Testing</w:t>
@@ -14836,7 +14836,7 @@
       <w:pPr>
         <w:pStyle w:val="Heading2"/>
       </w:pPr>
-      <w:bookmarkStart w:id="35" w:name="_Toc242986036"/>
+      <w:bookmarkStart w:id="35" w:name="_Toc242986227"/>
       <w:r>
         <w:t>7.1 Defects found by running the code</w:t>
       </w:r>
@@ -15672,7 +15672,7 @@
       <w:pPr>
         <w:pStyle w:val="Heading2"/>
       </w:pPr>
-      <w:bookmarkStart w:id="36" w:name="_Toc242986037"/>
+      <w:bookmarkStart w:id="36" w:name="_Toc242986228"/>
       <w:r>
         <w:t>7.2 Independent cross-validation against CAMS</w:t>
       </w:r>
@@ -15701,7 +15701,7 @@
           <w:noProof/>
         </w:rPr>
         <w:drawing>
-          <wp:inline distT="0" distB="0" distL="0" distR="0" wp14:anchorId="1778F544" wp14:editId="1665EC13">
+          <wp:inline distT="0" distB="0" distL="0" distR="0" wp14:anchorId="2F8A9B45" wp14:editId="737376B0">
             <wp:extent cx="3619500" cy="2228850"/>
             <wp:effectExtent l="0" t="0" r="0" b="0"/>
             <wp:docPr id="15" name="fig15" descr="Pearson correlation between CPCB and CAMS by pollutant" title="Pearson correlation between CPCB and CAMS by pollutant"/>
@@ -15761,7 +15761,7 @@
         <w:pStyle w:val="Heading1"/>
         <w:pageBreakBefore/>
       </w:pPr>
-      <w:bookmarkStart w:id="37" w:name="_Toc242986038"/>
+      <w:bookmarkStart w:id="37" w:name="_Toc242986229"/>
       <w:r>
         <w:lastRenderedPageBreak/>
         <w:t>8. Evidence</w:t>
@@ -16858,7 +16858,7 @@
         <w:pStyle w:val="Heading1"/>
         <w:pageBreakBefore/>
       </w:pPr>
-      <w:bookmarkStart w:id="38" w:name="_Toc242986039"/>
+      <w:bookmarkStart w:id="38" w:name="_Toc242986230"/>
       <w:r>
         <w:lastRenderedPageBreak/>
         <w:t>9. Challenges and Limitations</w:t>
@@ -17666,7 +17666,7 @@
       <w:pPr>
         <w:pStyle w:val="Heading2"/>
       </w:pPr>
-      <w:bookmarkStart w:id="39" w:name="_Toc242986040"/>
+      <w:bookmarkStart w:id="39" w:name="_Toc242986231"/>
       <w:r>
         <w:t>9.1 Limitations</w:t>
       </w:r>
@@ -17773,7 +17773,7 @@
         <w:pStyle w:val="Heading1"/>
         <w:pageBreakBefore/>
       </w:pPr>
-      <w:bookmarkStart w:id="40" w:name="_Toc242986041"/>
+      <w:bookmarkStart w:id="40" w:name="_Toc242986232"/>
       <w:r>
         <w:lastRenderedPageBreak/>
         <w:t>10. Conclusion and Future Work</w:t>
@@ -17802,7 +17802,7 @@
       <w:pPr>
         <w:pStyle w:val="Heading2"/>
       </w:pPr>
-      <w:bookmarkStart w:id="41" w:name="_Toc242986042"/>
+      <w:bookmarkStart w:id="41" w:name="_Toc242986233"/>
       <w:r>
         <w:t>10.1 Future work</w:t>
       </w:r>
@@ -17893,7 +17893,7 @@
         <w:pStyle w:val="Heading1"/>
         <w:pageBreakBefore/>
       </w:pPr>
-      <w:bookmarkStart w:id="42" w:name="_Toc242986043"/>
+      <w:bookmarkStart w:id="42" w:name="_Toc242986234"/>
       <w:r>
         <w:lastRenderedPageBreak/>
         <w:t>11. Repository and How to Reproduce</w:t>
@@ -18558,7 +18558,7 @@
       <w:pPr>
         <w:pStyle w:val="Heading2"/>
       </w:pPr>
-      <w:bookmarkStart w:id="43" w:name="_Toc242986044"/>
+      <w:bookmarkStart w:id="43" w:name="_Toc242986235"/>
       <w:r>
         <w:t>11.1 Running it</w:t>
       </w:r>
@@ -18645,7 +18645,7 @@
         <w:pStyle w:val="Heading1"/>
         <w:pageBreakBefore/>
       </w:pPr>
-      <w:bookmarkStart w:id="44" w:name="_Toc242986045"/>
+      <w:bookmarkStart w:id="44" w:name="_Toc242986236"/>
       <w:r>
         <w:lastRenderedPageBreak/>
         <w:t>References</w:t>
@@ -18933,10 +18933,96 @@
 <file path=word/numbering.xml><?xml version="1.0" encoding="utf-8"?>
 <w:numbering xmlns:wpc="http://schemas.microsoft.com/office/word/2010/wordprocessingCanvas" xmlns:cx="http://schemas.microsoft.com/office/drawing/2014/chartex" xmlns:cx1="http://schemas.microsoft.com/office/drawing/2015/9/8/chartex" xmlns:cx2="http://schemas.microsoft.com/office/drawing/2015/10/21/chartex" xmlns:cx3="http://schemas.microsoft.com/office/drawing/2016/5/9/chartex" xmlns:cx4="http://schemas.microsoft.com/office/drawing/2016/5/10/chartex" xmlns:cx5="http://schemas.microsoft.com/office/drawing/2016/5/11/chartex" xmlns:cx6="http://schemas.microsoft.com/office/drawing/2016/5/12/chartex" xmlns:cx7="http://schemas.microsoft.com/office/drawing/2016/5/13/chartex" xmlns:cx8="http://schemas.microsoft.com/office/drawing/2016/5/14/chartex" xmlns:mc="http://schemas.openxmlformats.org/markup-compatibility/2006" xmlns:aink="http://schemas.microsoft.com/office/drawing/2016/ink" xmlns:am3d="http://schemas.microsoft.com/office/drawing/2017/model3d" xmlns:o="urn:schemas-microsoft-com:office:office" xmlns:oel="http://schemas.microsoft.com/office/2019/extlst" xmlns:r="http://schemas.openxmlformats.org/officeDocument/2006/relationships" xmlns:m="http://schemas.openxmlformats.org/officeDocument/2006/math" xmlns:v="urn:schemas-microsoft-com:vml" xmlns:wp14="http://schemas.microsoft.com/office/word/2010/wordprocessingDrawing" xmlns:wp="http://schemas.openxmlformats.org/drawingml/2006/wordprocessingDrawing" xmlns:w10="urn:schemas-microsoft-com:office:word" xmlns:w="http://schemas.openxmlformats.org/wordprocessingml/2006/main" xmlns:w14="http://schemas.microsoft.com/office/word/2010/wordml" xmlns:w15="http://schemas.microsoft.com/office/word/2012/wordml" xmlns:w16cex="http://schemas.microsoft.com/office/word/2018/wordml/cex" xmlns:w16cid="http://schemas.microsoft.com/office/word/2016/wordml/cid" xmlns:w16="http://schemas.microsoft.com/office/word/2018/wordml" xmlns:w16du="http://schemas.microsoft.com/office/word/2023/wordml/word16du" xmlns:w16sdtdh="http://schemas.microsoft.com/office/word/2020/wordml/sdtdatahash" xmlns:w16sdtfl="http://schemas.microsoft.com/office/word/2024/wordml/sdtformatlock" xmlns:w16se="http://schemas.microsoft.com/office/word/2015/wordml/symex" xmlns:wpg="http://schemas.microsoft.com/office/word/2010/wordprocessingGroup" xmlns:wpi="http://schemas.microsoft.com/office/word/2010/wordprocessingInk" xmlns:wne="http://schemas.microsoft.com/office/word/2006/wordml" xmlns:wps="http://schemas.microsoft.com/office/word/2010/wordprocessingShape" mc:Ignorable="w14 w15 w16se w16cid w16 w16cex w16sdtdh w16sdtfl w16du wp14">
   <w:abstractNum w:abstractNumId="0" w15:restartNumberingAfterBreak="0">
-    <w:nsid w:val="31B36190"/>
+    <w:nsid w:val="323E36CE"/>
     <w:multiLevelType w:val="hybridMultilevel"/>
-    <w:tmpl w:val="25CC55D8"/>
-    <w:lvl w:ilvl="0" w:tplc="A76C80FE">
+    <w:tmpl w:val="9662B092"/>
+    <w:lvl w:ilvl="0" w:tplc="6D7ED6A6" w:tentative="1">
+      <w:start w:val="1"/>
+      <w:numFmt w:val="bullet"/>
+      <w:lvlText w:val="●"/>
+      <w:lvlJc w:val="left"/>
+      <w:pPr>
+        <w:ind w:left="720" w:hanging="360"/>
+      </w:pPr>
+    </w:lvl>
+    <w:lvl w:ilvl="1" w:tplc="3DC40F44" w:tentative="1">
+      <w:start w:val="1"/>
+      <w:numFmt w:val="bullet"/>
+      <w:lvlText w:val="○"/>
+      <w:lvlJc w:val="left"/>
+      <w:pPr>
+        <w:ind w:left="1440" w:hanging="360"/>
+      </w:pPr>
+    </w:lvl>
+    <w:lvl w:ilvl="2" w:tplc="0B3C5A22" w:tentative="1">
+      <w:start w:val="1"/>
+      <w:numFmt w:val="bullet"/>
+      <w:lvlText w:val="■"/>
+      <w:lvlJc w:val="left"/>
+      <w:pPr>
+        <w:ind w:left="2160" w:hanging="360"/>
+      </w:pPr>
+    </w:lvl>
+    <w:lvl w:ilvl="3" w:tplc="257EDBCE" w:tentative="1">
+      <w:start w:val="1"/>
+      <w:numFmt w:val="bullet"/>
+      <w:lvlText w:val="●"/>
+      <w:lvlJc w:val="left"/>
+      <w:pPr>
+        <w:ind w:left="2880" w:hanging="360"/>
+      </w:pPr>
+    </w:lvl>
+    <w:lvl w:ilvl="4" w:tplc="24B458A8" w:tentative="1">
+      <w:start w:val="1"/>
+      <w:numFmt w:val="bullet"/>
+      <w:lvlText w:val="○"/>
+      <w:lvlJc w:val="left"/>
+      <w:pPr>
+        <w:ind w:left="3600" w:hanging="360"/>
+      </w:pPr>
+    </w:lvl>
+    <w:lvl w:ilvl="5" w:tplc="A0C05B2C" w:tentative="1">
+      <w:start w:val="1"/>
+      <w:numFmt w:val="bullet"/>
+      <w:lvlText w:val="■"/>
+      <w:lvlJc w:val="left"/>
+      <w:pPr>
+        <w:ind w:left="4320" w:hanging="360"/>
+      </w:pPr>
+    </w:lvl>
+    <w:lvl w:ilvl="6" w:tplc="276E29A8" w:tentative="1">
+      <w:start w:val="1"/>
+      <w:numFmt w:val="bullet"/>
+      <w:lvlText w:val="●"/>
+      <w:lvlJc w:val="left"/>
+      <w:pPr>
+        <w:ind w:left="5040" w:hanging="360"/>
+      </w:pPr>
+    </w:lvl>
+    <w:lvl w:ilvl="7" w:tplc="56F8CDD4" w:tentative="1">
+      <w:start w:val="1"/>
+      <w:numFmt w:val="bullet"/>
+      <w:lvlText w:val="●"/>
+      <w:lvlJc w:val="left"/>
+      <w:pPr>
+        <w:ind w:left="5760" w:hanging="360"/>
+      </w:pPr>
+    </w:lvl>
+    <w:lvl w:ilvl="8" w:tplc="E7460850" w:tentative="1">
+      <w:start w:val="1"/>
+      <w:numFmt w:val="bullet"/>
+      <w:lvlText w:val="●"/>
+      <w:lvlJc w:val="left"/>
+      <w:pPr>
+        <w:ind w:left="6480" w:hanging="360"/>
+      </w:pPr>
+    </w:lvl>
+  </w:abstractNum>
+  <w:abstractNum w:abstractNumId="1" w15:restartNumberingAfterBreak="0">
+    <w:nsid w:val="3DE40DA3"/>
+    <w:multiLevelType w:val="hybridMultilevel"/>
+    <w:tmpl w:val="905EF77E"/>
+    <w:lvl w:ilvl="0" w:tplc="38569C00">
       <w:start w:val="1"/>
       <w:numFmt w:val="decimal"/>
       <w:lvlText w:val="%1."/>
@@ -18945,261 +19031,175 @@
         <w:ind w:left="540" w:hanging="360"/>
       </w:pPr>
     </w:lvl>
-    <w:lvl w:ilvl="1" w:tplc="09B01448">
+    <w:lvl w:ilvl="1" w:tplc="4DAE8FAA">
       <w:numFmt w:val="decimal"/>
       <w:lvlText w:val=""/>
       <w:lvlJc w:val="left"/>
     </w:lvl>
-    <w:lvl w:ilvl="2" w:tplc="5950D686">
+    <w:lvl w:ilvl="2" w:tplc="05FE54FC">
       <w:numFmt w:val="decimal"/>
       <w:lvlText w:val=""/>
       <w:lvlJc w:val="left"/>
     </w:lvl>
-    <w:lvl w:ilvl="3" w:tplc="625CDBDA">
+    <w:lvl w:ilvl="3" w:tplc="D97E6770">
       <w:numFmt w:val="decimal"/>
       <w:lvlText w:val=""/>
       <w:lvlJc w:val="left"/>
     </w:lvl>
-    <w:lvl w:ilvl="4" w:tplc="E222F682">
+    <w:lvl w:ilvl="4" w:tplc="B802AC78">
       <w:numFmt w:val="decimal"/>
       <w:lvlText w:val=""/>
       <w:lvlJc w:val="left"/>
     </w:lvl>
-    <w:lvl w:ilvl="5" w:tplc="6108F2E4">
+    <w:lvl w:ilvl="5" w:tplc="294C9634">
       <w:numFmt w:val="decimal"/>
       <w:lvlText w:val=""/>
       <w:lvlJc w:val="left"/>
     </w:lvl>
-    <w:lvl w:ilvl="6" w:tplc="DE90F856">
+    <w:lvl w:ilvl="6" w:tplc="E782EE50">
       <w:numFmt w:val="decimal"/>
       <w:lvlText w:val=""/>
       <w:lvlJc w:val="left"/>
     </w:lvl>
-    <w:lvl w:ilvl="7" w:tplc="81AE94BC">
+    <w:lvl w:ilvl="7" w:tplc="14D0B6B0">
       <w:numFmt w:val="decimal"/>
       <w:lvlText w:val=""/>
       <w:lvlJc w:val="left"/>
     </w:lvl>
-    <w:lvl w:ilvl="8" w:tplc="5D945F04">
-      <w:numFmt w:val="decimal"/>
-      <w:lvlText w:val=""/>
-      <w:lvlJc w:val="left"/>
-    </w:lvl>
-  </w:abstractNum>
-  <w:abstractNum w:abstractNumId="1" w15:restartNumberingAfterBreak="0">
-    <w:nsid w:val="41D552E7"/>
-    <w:multiLevelType w:val="hybridMultilevel"/>
-    <w:tmpl w:val="6D12A9AA"/>
-    <w:lvl w:ilvl="0" w:tplc="4C5855BE">
-      <w:start w:val="1"/>
-      <w:numFmt w:val="decimal"/>
-      <w:lvlText w:val="%1."/>
-      <w:lvlJc w:val="left"/>
-      <w:pPr>
-        <w:ind w:left="540" w:hanging="360"/>
-      </w:pPr>
-    </w:lvl>
-    <w:lvl w:ilvl="1" w:tplc="A9F6E1B2">
-      <w:numFmt w:val="decimal"/>
-      <w:lvlText w:val=""/>
-      <w:lvlJc w:val="left"/>
-    </w:lvl>
-    <w:lvl w:ilvl="2" w:tplc="26561992">
-      <w:numFmt w:val="decimal"/>
-      <w:lvlText w:val=""/>
-      <w:lvlJc w:val="left"/>
-    </w:lvl>
-    <w:lvl w:ilvl="3" w:tplc="462A1DA8">
-      <w:numFmt w:val="decimal"/>
-      <w:lvlText w:val=""/>
-      <w:lvlJc w:val="left"/>
-    </w:lvl>
-    <w:lvl w:ilvl="4" w:tplc="31A2743C">
-      <w:numFmt w:val="decimal"/>
-      <w:lvlText w:val=""/>
-      <w:lvlJc w:val="left"/>
-    </w:lvl>
-    <w:lvl w:ilvl="5" w:tplc="8492597C">
-      <w:numFmt w:val="decimal"/>
-      <w:lvlText w:val=""/>
-      <w:lvlJc w:val="left"/>
-    </w:lvl>
-    <w:lvl w:ilvl="6" w:tplc="58788E8E">
-      <w:numFmt w:val="decimal"/>
-      <w:lvlText w:val=""/>
-      <w:lvlJc w:val="left"/>
-    </w:lvl>
-    <w:lvl w:ilvl="7" w:tplc="88303A5E">
-      <w:numFmt w:val="decimal"/>
-      <w:lvlText w:val=""/>
-      <w:lvlJc w:val="left"/>
-    </w:lvl>
-    <w:lvl w:ilvl="8" w:tplc="9B0C89DC">
+    <w:lvl w:ilvl="8" w:tplc="1338A9F0">
       <w:numFmt w:val="decimal"/>
       <w:lvlText w:val=""/>
       <w:lvlJc w:val="left"/>
     </w:lvl>
   </w:abstractNum>
   <w:abstractNum w:abstractNumId="2" w15:restartNumberingAfterBreak="0">
-    <w:nsid w:val="42143A8F"/>
+    <w:nsid w:val="42C37445"/>
     <w:multiLevelType w:val="hybridMultilevel"/>
-    <w:tmpl w:val="8BB2A05A"/>
-    <w:lvl w:ilvl="0" w:tplc="46D0F09C">
+    <w:tmpl w:val="819230AE"/>
+    <w:lvl w:ilvl="0" w:tplc="F8F473D4">
       <w:start w:val="1"/>
-      <w:numFmt w:val="bullet"/>
-      <w:lvlText w:val="•"/>
+      <w:numFmt w:val="decimal"/>
+      <w:lvlText w:val="%1."/>
       <w:lvlJc w:val="left"/>
       <w:pPr>
-        <w:ind w:left="540" w:hanging="270"/>
+        <w:ind w:left="540" w:hanging="360"/>
       </w:pPr>
     </w:lvl>
-    <w:lvl w:ilvl="1" w:tplc="2DAA4DFA">
+    <w:lvl w:ilvl="1" w:tplc="2F88BC64">
       <w:numFmt w:val="decimal"/>
       <w:lvlText w:val=""/>
       <w:lvlJc w:val="left"/>
     </w:lvl>
-    <w:lvl w:ilvl="2" w:tplc="EECA7EDE">
+    <w:lvl w:ilvl="2" w:tplc="E98677FA">
       <w:numFmt w:val="decimal"/>
       <w:lvlText w:val=""/>
       <w:lvlJc w:val="left"/>
     </w:lvl>
-    <w:lvl w:ilvl="3" w:tplc="AFE8EF38">
+    <w:lvl w:ilvl="3" w:tplc="3CB672C4">
       <w:numFmt w:val="decimal"/>
       <w:lvlText w:val=""/>
       <w:lvlJc w:val="left"/>
     </w:lvl>
-    <w:lvl w:ilvl="4" w:tplc="B65EB3BE">
+    <w:lvl w:ilvl="4" w:tplc="6CE4E9CE">
       <w:numFmt w:val="decimal"/>
       <w:lvlText w:val=""/>
       <w:lvlJc w:val="left"/>
     </w:lvl>
-    <w:lvl w:ilvl="5" w:tplc="1786B7B8">
+    <w:lvl w:ilvl="5" w:tplc="0E1C9552">
       <w:numFmt w:val="decimal"/>
       <w:lvlText w:val=""/>
       <w:lvlJc w:val="left"/>
     </w:lvl>
-    <w:lvl w:ilvl="6" w:tplc="98625D3A">
+    <w:lvl w:ilvl="6" w:tplc="D834FA0C">
       <w:numFmt w:val="decimal"/>
       <w:lvlText w:val=""/>
       <w:lvlJc w:val="left"/>
     </w:lvl>
-    <w:lvl w:ilvl="7" w:tplc="102EF52E">
+    <w:lvl w:ilvl="7" w:tplc="3742359A">
       <w:numFmt w:val="decimal"/>
       <w:lvlText w:val=""/>
       <w:lvlJc w:val="left"/>
     </w:lvl>
-    <w:lvl w:ilvl="8" w:tplc="6862F9FE">
+    <w:lvl w:ilvl="8" w:tplc="E6B2BC24">
       <w:numFmt w:val="decimal"/>
       <w:lvlText w:val=""/>
       <w:lvlJc w:val="left"/>
     </w:lvl>
   </w:abstractNum>
   <w:abstractNum w:abstractNumId="3" w15:restartNumberingAfterBreak="0">
-    <w:nsid w:val="51EE6FA0"/>
+    <w:nsid w:val="6BD94581"/>
     <w:multiLevelType w:val="hybridMultilevel"/>
-    <w:tmpl w:val="6882C69A"/>
-    <w:lvl w:ilvl="0" w:tplc="A61E3818" w:tentative="1">
+    <w:tmpl w:val="2CA06634"/>
+    <w:lvl w:ilvl="0" w:tplc="4CD868F8">
       <w:start w:val="1"/>
       <w:numFmt w:val="bullet"/>
-      <w:lvlText w:val="●"/>
+      <w:lvlText w:val="•"/>
       <w:lvlJc w:val="left"/>
       <w:pPr>
-        <w:ind w:left="720" w:hanging="360"/>
+        <w:ind w:left="540" w:hanging="270"/>
       </w:pPr>
     </w:lvl>
-    <w:lvl w:ilvl="1" w:tplc="433CE998" w:tentative="1">
-      <w:start w:val="1"/>
-      <w:numFmt w:val="bullet"/>
-      <w:lvlText w:val="○"/>
+    <w:lvl w:ilvl="1" w:tplc="6C685412">
+      <w:numFmt w:val="decimal"/>
+      <w:lvlText w:val=""/>
       <w:lvlJc w:val="left"/>
-      <w:pPr>
-        <w:ind w:left="1440" w:hanging="360"/>
-      </w:pPr>
     </w:lvl>
-    <w:lvl w:ilvl="2" w:tplc="051A111A" w:tentative="1">
-      <w:start w:val="1"/>
-      <w:numFmt w:val="bullet"/>
-      <w:lvlText w:val="■"/>
+    <w:lvl w:ilvl="2" w:tplc="CB4A6838">
+      <w:numFmt w:val="decimal"/>
+      <w:lvlText w:val=""/>
       <w:lvlJc w:val="left"/>
-      <w:pPr>
-        <w:ind w:left="2160" w:hanging="360"/>
-      </w:pPr>
     </w:lvl>
-    <w:lvl w:ilvl="3" w:tplc="60062E58" w:tentative="1">
-      <w:start w:val="1"/>
-      <w:numFmt w:val="bullet"/>
-      <w:lvlText w:val="●"/>
+    <w:lvl w:ilvl="3" w:tplc="A402832A">
+      <w:numFmt w:val="decimal"/>
+      <w:lvlText w:val=""/>
       <w:lvlJc w:val="left"/>
-      <w:pPr>
-        <w:ind w:left="2880" w:hanging="360"/>
-      </w:pPr>
     </w:lvl>
-    <w:lvl w:ilvl="4" w:tplc="6F580BB6" w:tentative="1">
-      <w:start w:val="1"/>
-      <w:numFmt w:val="bullet"/>
-      <w:lvlText w:val="○"/>
+    <w:lvl w:ilvl="4" w:tplc="6E82147A">
+      <w:numFmt w:val="decimal"/>
+      <w:lvlText w:val=""/>
       <w:lvlJc w:val="left"/>
-      <w:pPr>
-        <w:ind w:left="3600" w:hanging="360"/>
-      </w:pPr>
     </w:lvl>
-    <w:lvl w:ilvl="5" w:tplc="92C89DC8" w:tentative="1">
-      <w:start w:val="1"/>
-      <w:numFmt w:val="bullet"/>
-      <w:lvlText w:val="■"/>
+    <w:lvl w:ilvl="5" w:tplc="042E98A2">
+      <w:numFmt w:val="decimal"/>
+      <w:lvlText w:val=""/>
       <w:lvlJc w:val="left"/>
-      <w:pPr>
-        <w:ind w:left="4320" w:hanging="360"/>
-      </w:pPr>
     </w:lvl>
-    <w:lvl w:ilvl="6" w:tplc="A058DF6A" w:tentative="1">
-      <w:start w:val="1"/>
-      <w:numFmt w:val="bullet"/>
-      <w:lvlText w:val="●"/>
+    <w:lvl w:ilvl="6" w:tplc="E9D41110">
+      <w:numFmt w:val="decimal"/>
+      <w:lvlText w:val=""/>
       <w:lvlJc w:val="left"/>
-      <w:pPr>
-        <w:ind w:left="5040" w:hanging="360"/>
-      </w:pPr>
     </w:lvl>
-    <w:lvl w:ilvl="7" w:tplc="6E5C3082" w:tentative="1">
-      <w:start w:val="1"/>
-      <w:numFmt w:val="bullet"/>
-      <w:lvlText w:val="●"/>
+    <w:lvl w:ilvl="7" w:tplc="E5BAA69C">
+      <w:numFmt w:val="decimal"/>
+      <w:lvlText w:val=""/>
       <w:lvlJc w:val="left"/>
-      <w:pPr>
-        <w:ind w:left="5760" w:hanging="360"/>
-      </w:pPr>
     </w:lvl>
-    <w:lvl w:ilvl="8" w:tplc="54A842B2" w:tentative="1">
-      <w:start w:val="1"/>
-      <w:numFmt w:val="bullet"/>
-      <w:lvlText w:val="●"/>
+    <w:lvl w:ilvl="8" w:tplc="569C1E0C">
+      <w:numFmt w:val="decimal"/>
+      <w:lvlText w:val=""/>
       <w:lvlJc w:val="left"/>
-      <w:pPr>
-        <w:ind w:left="6480" w:hanging="360"/>
-      </w:pPr>
     </w:lvl>
   </w:abstractNum>
-  <w:num w:numId="1" w16cid:durableId="1471510562">
+  <w:num w:numId="1" w16cid:durableId="552665184">
+    <w:abstractNumId w:val="0"/>
+    <w:lvlOverride w:ilvl="0">
+      <w:startOverride w:val="1"/>
+    </w:lvlOverride>
+  </w:num>
+  <w:num w:numId="2" w16cid:durableId="1481340152">
     <w:abstractNumId w:val="3"/>
     <w:lvlOverride w:ilvl="0">
       <w:startOverride w:val="1"/>
     </w:lvlOverride>
   </w:num>
-  <w:num w:numId="2" w16cid:durableId="1870072524">
+  <w:num w:numId="3" w16cid:durableId="1738702779">
     <w:abstractNumId w:val="2"/>
     <w:lvlOverride w:ilvl="0">
       <w:startOverride w:val="1"/>
     </w:lvlOverride>
   </w:num>
-  <w:num w:numId="3" w16cid:durableId="2021620457">
+  <w:num w:numId="4" w16cid:durableId="1031152452">
     <w:abstractNumId w:val="1"/>
-    <w:lvlOverride w:ilvl="0">
-      <w:startOverride w:val="1"/>
-    </w:lvlOverride>
-  </w:num>
-  <w:num w:numId="4" w16cid:durableId="2031948142">
-    <w:abstractNumId w:val="0"/>
     <w:lvlOverride w:ilvl="0">
       <w:startOverride w:val="1"/>
     </w:lvlOverride>
@@ -19841,7 +19841,7 @@
     <w:autoRedefine/>
     <w:uiPriority w:val="39"/>
     <w:unhideWhenUsed/>
-    <w:rsid w:val="002C509F"/>
+    <w:rsid w:val="00032EDF"/>
     <w:pPr>
       <w:spacing w:after="100"/>
     </w:pPr>
@@ -19853,7 +19853,7 @@
     <w:autoRedefine/>
     <w:uiPriority w:val="39"/>
     <w:unhideWhenUsed/>
-    <w:rsid w:val="002C509F"/>
+    <w:rsid w:val="00032EDF"/>
     <w:pPr>
       <w:spacing w:after="100"/>
       <w:ind w:left="220"/>

</xml_diff>